<commit_message>
Flag papers newer than the SCImago data under a publication-basis quartile filter
With --quartile and --quartile-basis publication (the default basis), a paper
published after the last SCImago year whose source is in the latest snapshot
(ranking_basis LATEST_AVAILABLE) has no publication-year quartile and fails the
filter, as before. It now gets the reasons
"QUARTILE_UNAVAILABLE; QUARTILE_PUBLICATION_YEAR_NOT_AVAILABLE" (the generic
reason is kept for compatibility), run and enrich print a warning with the
number of such papers, and summary.json always contains
quartile_filter_diagnostics. The latest quartile is never copied into the
publication-year columns, and the main corpus does not change.

6 new offline tests (81 in total). README, the user guide (Word and Markdown)
and CHANGELOG (Unreleased) describe the publication and latest bases for
these papers.
</commit_message>
<xml_diff>
--- a/docs/OpenAlex_Literature_Intelligence_User_Guide.docx
+++ b/docs/OpenAlex_Literature_Intelligence_User_Guide.docx
@@ -4701,7 +4701,7 @@
               <w:rPr>
                 <w:sz w:val="17"/>
               </w:rPr>
-              <w:t>Counts by status, source class, match method, quartile, ranking basis.</w:t>
+              <w:t>Counts by status, source class, match method, quartile, ranking basis; quartile filter diagnostics.</w:t>
             </w:r>
           </w:p>
         </w:tc>
@@ -9239,7 +9239,7 @@
         <w:spacing w:after="80" w:line="252" w:lineRule="auto"/>
       </w:pPr>
       <w:r>
-        <w:t>A 2026 paper cannot have a publication-year 2026 quartile while the latest SCImago snapshot is 2025, so it will not pass a publication-basis Q1/Q2 filter.</w:t>
+        <w:t>The publication basis, the default, screens each paper by the quartile of the year it was published. The SCImago data end at 2025, so a 2026 paper has no publication-year quartile and fails a publication-basis Q1/Q2 filter; the tool never copies the 2025 quartile into the publication-year columns. When the source is in the latest snapshot (ranking_basis LATEST_AVAILABLE), the exclusion reasons are QUARTILE_UNAVAILABLE; QUARTILE_PUBLICATION_YEAR_NOT_AVAILABLE, run and enrich print a warning with the number of such papers, and summary.json counts them under quartile_filter_diagnostics (0 when no paper is affected). --quartile-basis latest (section 11.5) screens these papers by the latest available snapshot, which for a 2026 paper is the 2025 quartile of its venue, not a 2026 quartile.</w:t>
       </w:r>
     </w:p>
     <w:p>
@@ -10187,7 +10187,7 @@
               <w:rPr>
                 <w:sz w:val="17"/>
               </w:rPr>
-              <w:t>Paper and unique-source counts by status, class, method, quartile, and ranking basis.</w:t>
+              <w:t>Paper and unique-source counts by status, class, method, quartile, and ranking basis; quartile_filter_diagnostics counts the papers that fail a publication-basis quartile filter because they were published after the last SCImago year.</w:t>
             </w:r>
           </w:p>
         </w:tc>
@@ -11534,6 +11534,54 @@
                 <w:sz w:val="17"/>
               </w:rPr>
               <w:t>No quartile exists for the requested basis/mode.</w:t>
+            </w:r>
+          </w:p>
+        </w:tc>
+      </w:tr>
+      <w:tr>
+        <w:tc>
+          <w:tcPr>
+            <w:tcW w:type="dxa" w:w="4176"/>
+            <w:vAlign w:val="center"/>
+            <w:tcMar>
+              <w:top w:w="80" w:type="dxa"/>
+              <w:start w:w="90" w:type="dxa"/>
+              <w:bottom w:w="80" w:type="dxa"/>
+              <w:end w:w="90" w:type="dxa"/>
+            </w:tcMar>
+          </w:tcPr>
+          <w:p>
+            <w:pPr>
+              <w:spacing w:after="0"/>
+            </w:pPr>
+            <w:r>
+              <w:rPr>
+                <w:sz w:val="17"/>
+              </w:rPr>
+              <w:t>QUARTILE_PUBLICATION_YEAR_NOT_AVAILABLE</w:t>
+            </w:r>
+          </w:p>
+        </w:tc>
+        <w:tc>
+          <w:tcPr>
+            <w:tcW w:type="dxa" w:w="5616"/>
+            <w:vAlign w:val="center"/>
+            <w:tcMar>
+              <w:top w:w="80" w:type="dxa"/>
+              <w:start w:w="90" w:type="dxa"/>
+              <w:bottom w:w="80" w:type="dxa"/>
+              <w:end w:w="90" w:type="dxa"/>
+            </w:tcMar>
+          </w:tcPr>
+          <w:p>
+            <w:pPr>
+              <w:spacing w:after="0"/>
+            </w:pPr>
+            <w:r>
+              <w:rPr>
+                <w:sz w:val="17"/>
+              </w:rPr>
+              <w:t>Added to QUARTILE_UNAVAILABLE with --quartile-basis publication when the paper was published after the last SCImago year and its source is in the latest snapshot (ranking_basis LATEST_AVAILABLE).</w:t>
             </w:r>
           </w:p>
         </w:tc>
@@ -12975,7 +13023,7 @@
               <w:rPr>
                 <w:sz w:val="17"/>
               </w:rPr>
-              <w:t>Expected; use --quartile-basis latest if your question concerns latest quartile.</w:t>
+              <w:t>Expected: such papers get QUARTILE_PUBLICATION_YEAR_NOT_AVAILABLE, and run and enrich print a warning with their number. Use --quartile-basis latest if your question concerns the latest quartile, which is not a 2026 quartile.</w:t>
             </w:r>
           </w:p>
         </w:tc>

</xml_diff>

<commit_message>
OpenAlex Literature Intelligence v3.3.0
Release of the changes on main since v3.2.0; see CHANGELOG.md and
TEST_REPORT.md.

- Papers published after the last SCImago year are reported precisely when a
  publication-basis quartile filter excludes them: the extra exclusion reason
  QUARTILE_PUBLICATION_YEAR_NOT_AVAILABLE, a console warning for run and
  enrich, and quartile_filter_diagnostics in summary.json. The main corpus
  does not change.
- Vietnamese README and quick start cover the features added since 3.0.5.

81 offline tests pass in a fresh environment; the reference-corpus regression
gives the same files as 3.2.0. The tree is identical to the local release
package OpenAlex_Literature_Intelligence_v3.3.0.zip
(SHA-256 93892fd638855a749bff85a44cd9f03941b2a316f970f6a3f202503e842a5763).
</commit_message>
<xml_diff>
--- a/docs/OpenAlex_Literature_Intelligence_User_Guide.docx
+++ b/docs/OpenAlex_Literature_Intelligence_User_Guide.docx
@@ -38,7 +38,7 @@
           <w:b/>
           <w:sz w:val="30"/>
         </w:rPr>
-        <w:t>Version 3.2.0</w:t>
+        <w:t>Version 3.3.0</w:t>
       </w:r>
     </w:p>
     <w:p>
@@ -86,7 +86,7 @@
         <w:rPr>
           <w:i/>
         </w:rPr>
-        <w:t>Release 3.2.0: 27 October 2026 (Stable 3.0.5: 25 October 2026)</w:t>
+        <w:t>Release 3.3.0: 27 October 2026 (Stable 3.0.5: 25 October 2026)</w:t>
       </w:r>
     </w:p>
     <w:p>
@@ -19360,7 +19360,7 @@
         <w:spacing w:after="30"/>
       </w:pPr>
       <w:r>
-        <w:t xml:space="preserve">Requests are sent one at a time, at least --delay seconds apart for the same host (default 2 s, minimum 1 s), with the User-Agent OpenAlexLiteratureIntelligence/3.2.0 and a link to the project repository.</w:t>
+        <w:t xml:space="preserve">Requests are sent one at a time, at least --delay seconds apart for the same host (default 2 s, minimum 1 s), with the User-Agent OpenAlexLiteratureIntelligence/3.3.0 and a link to the project repository.</w:t>
       </w:r>
     </w:p>
     <w:p>
@@ -19996,7 +19996,7 @@
         <w:color w:val="787878"/>
         <w:sz w:val="16"/>
       </w:rPr>
-      <w:t xml:space="preserve">OpenAlex Literature Intelligence v3.2.0  |  Page </w:t>
+      <w:t xml:space="preserve">OpenAlex Literature Intelligence v3.3.0  |  Page </w:t>
     </w:r>
     <w:fldSimple w:instr="PAGE"/>
   </w:p>

</xml_diff>

<commit_message>
OpenAlex Literature Intelligence v4.0.0
Behavior change: the default --quartile-basis is now latest instead of
publication, so a quartile filter no longer drops papers newer than the
SCImago data by accident. With the latest basis every paper is judged by its
venue's quartile in the latest snapshot (for a 2026 paper, the 2025 quartile
of its venue, not a 2026 quartile), and HISTORICAL_ONLY sources fail a
quartile filter. Pass --quartile-basis publication to keep the 3.x behavior;
the library functions apply_main_policy and quartile_filter_diagnostics use
the same new default. "behaviour" is spelled "behavior" throughout.

81 offline tests pass in a fresh environment; without a quartile filter the
reference-corpus regression gives the same files as 3.3.0. The tree is
identical to the local release package OpenAlex_Literature_Intelligence_v4.0.0.zip
(SHA-256 beb94714fb8afbeed74b3042876fba3a8214c69cd9e43412a12263571d1a662b).
</commit_message>
<xml_diff>
--- a/docs/OpenAlex_Literature_Intelligence_User_Guide.docx
+++ b/docs/OpenAlex_Literature_Intelligence_User_Guide.docx
@@ -38,7 +38,7 @@
           <w:b/>
           <w:sz w:val="30"/>
         </w:rPr>
-        <w:t>Version 3.3.0</w:t>
+        <w:t>Version 4.0.0</w:t>
       </w:r>
     </w:p>
     <w:p>
@@ -86,7 +86,7 @@
         <w:rPr>
           <w:i/>
         </w:rPr>
-        <w:t>Release 3.3.0: 27 October 2026 (Stable 3.0.5: 25 October 2026)</w:t>
+        <w:t>Release 4.0.0: 28 October 2026 (Stable 3.0.5: 25 October 2026)</w:t>
       </w:r>
     </w:p>
     <w:p>
@@ -9239,7 +9239,7 @@
         <w:spacing w:after="80" w:line="252" w:lineRule="auto"/>
       </w:pPr>
       <w:r>
-        <w:t>The publication basis, the default, screens each paper by the quartile of the year it was published. The SCImago data end at 2025, so a 2026 paper has no publication-year quartile and fails a publication-basis Q1/Q2 filter; the tool never copies the 2025 quartile into the publication-year columns. When the source is in the latest snapshot (ranking_basis LATEST_AVAILABLE), the exclusion reasons are QUARTILE_UNAVAILABLE; QUARTILE_PUBLICATION_YEAR_NOT_AVAILABLE, run and enrich print a warning with the number of such papers, and summary.json counts them under quartile_filter_diagnostics (0 when no paper is affected). --quartile-basis latest (section 11.5) screens these papers by the latest available snapshot, which for a 2026 paper is the 2025 quartile of its venue, not a 2026 quartile.</w:t>
+        <w:t>The publication basis screens each paper by the quartile of the year it was published, which suits historical analyses; up to v3.3.0 it was the default, and the example therefore names it explicitly. The SCImago data end at 2025, so a 2026 paper has no publication-year quartile and fails a publication-basis Q1/Q2 filter; the tool never copies the 2025 quartile into the publication-year columns. When the source is in the latest snapshot (ranking_basis LATEST_AVAILABLE), the exclusion reasons are QUARTILE_UNAVAILABLE; QUARTILE_PUBLICATION_YEAR_NOT_AVAILABLE, run and enrich print a warning with the number of such papers, and summary.json counts them under quartile_filter_diagnostics (0 when no paper is affected). The default basis, latest (section 11.5), screens these papers by the latest available snapshot, which for a 2026 paper is the 2025 quartile of its venue, not a 2026 quartile.</w:t>
       </w:r>
     </w:p>
     <w:p>
@@ -9273,6 +9273,14 @@
         <w:t xml:space="preserve">  --quartile-basis latest `</w:t>
         <w:br/>
         <w:t xml:space="preserve">  --output malware_latest_q1q2</w:t>
+      </w:r>
+    </w:p>
+    <w:p>
+      <w:pPr>
+        <w:spacing w:after="80" w:line="252" w:lineRule="auto"/>
+      </w:pPr>
+      <w:r>
+        <w:t xml:space="preserve">latest is the default basis: --quartile without --quartile-basis screens every paper by its venue's quartile in the latest SCImago snapshot, so the newest papers are not excluded by accident. For a 2026 paper that is the 2025 quartile of its venue, not a 2026 quartile, and an older paper is also judged by its venue's 2025 quartile rather than by the quartile of its publication year. Sources found only in earlier snapshots (HISTORICAL_ONLY, admitted with --include-historical-only) have no latest quartile and fail a quartile filter on this basis; use --quartile-basis publication for them.</w:t>
       </w:r>
     </w:p>
     <w:p>
@@ -13023,7 +13031,7 @@
               <w:rPr>
                 <w:sz w:val="17"/>
               </w:rPr>
-              <w:t>Expected: such papers get QUARTILE_PUBLICATION_YEAR_NOT_AVAILABLE, and run and enrich print a warning with their number. Use --quartile-basis latest if your question concerns the latest quartile, which is not a 2026 quartile.</w:t>
+              <w:t>Expected: such papers get QUARTILE_PUBLICATION_YEAR_NOT_AVAILABLE, and run and enrich print a warning with their number. Use --quartile-basis latest (the default) if your question concerns the latest quartile, which is not a 2026 quartile.</w:t>
             </w:r>
           </w:p>
         </w:tc>
@@ -14923,7 +14931,7 @@
               <w:rPr>
                 <w:sz w:val="17"/>
               </w:rPr>
-              <w:t>--quartile-basis publication|latest</w:t>
+              <w:t>--quartile-basis latest|publication</w:t>
             </w:r>
           </w:p>
         </w:tc>
@@ -14946,7 +14954,7 @@
               <w:rPr>
                 <w:sz w:val="17"/>
               </w:rPr>
-              <w:t>Choose snapshot basis for Q filtering.</w:t>
+              <w:t>Snapshot basis for --quartile filtering; default latest (section 11.5).</w:t>
             </w:r>
           </w:p>
         </w:tc>
@@ -19360,7 +19368,7 @@
         <w:spacing w:after="30"/>
       </w:pPr>
       <w:r>
-        <w:t xml:space="preserve">Requests are sent one at a time, at least --delay seconds apart for the same host (default 2 s, minimum 1 s), with the User-Agent OpenAlexLiteratureIntelligence/3.3.0 and a link to the project repository.</w:t>
+        <w:t xml:space="preserve">Requests are sent one at a time, at least --delay seconds apart for the same host (default 2 s, minimum 1 s), with the User-Agent OpenAlexLiteratureIntelligence/4.0.0 and a link to the project repository.</w:t>
       </w:r>
     </w:p>
     <w:p>
@@ -19877,7 +19885,7 @@
         <w:spacing w:after="30"/>
       </w:pPr>
       <w:r>
-        <w:t xml:space="preserve">search, the default and the only behaviour before v3.2.0: the query goes to the OpenAlex search parameter, which matches the title, the abstract and, for works whose full text OpenAlex has indexed, the full text.</w:t>
+        <w:t xml:space="preserve">search, the default and the only behavior before v3.2.0: the query goes to the OpenAlex search parameter, which matches the title, the abstract and, for works whose full text OpenAlex has indexed, the full text.</w:t>
       </w:r>
     </w:p>
     <w:p>
@@ -19996,7 +20004,7 @@
         <w:color w:val="787878"/>
         <w:sz w:val="16"/>
       </w:rPr>
-      <w:t xml:space="preserve">OpenAlex Literature Intelligence v3.3.0  |  Page </w:t>
+      <w:t xml:space="preserve">OpenAlex Literature Intelligence v4.0.0  |  Page </w:t>
     </w:r>
     <w:fldSimple w:instr="PAGE"/>
   </w:p>

</xml_diff>